<commit_message>
Add 18 Picnic topics; switch Exam Generator to 2027 texts
- 18 new Picnic at Hanging Rock practice topics (56 total), built from
  the idea x task-type framework.
- Exam Generator now draws Section A topics from Picnic at Hanging Rock
  and The Lottery and Other Stories, and the Word template's text list
  names the 2027 texts.

Co-Authored-By: Claude Opus 5.5 <noreply@anthropic.com>
</commit_message>
<xml_diff>
--- a/examgen/web-template.docx
+++ b/examgen/web-template.docx
@@ -4650,7 +4650,7 @@
           <w:w w:val="105"/>
           <w:sz w:val="21"/>
         </w:rPr>
-        <w:t>Sunset</w:t>
+        <w:t>Picnic at Hanging Rock</w:t>
       </w:r>
       <w:r>
         <w:rPr>
@@ -4660,7 +4660,7 @@
           <w:w w:val="105"/>
           <w:sz w:val="21"/>
         </w:rPr>
-        <w:t xml:space="preserve"> </w:t>
+        <w:t xml:space="preserve"/>
       </w:r>
       <w:r>
         <w:rPr>
@@ -4669,7 +4669,7 @@
           <w:w w:val="105"/>
           <w:sz w:val="21"/>
         </w:rPr>
-        <w:t>Boulevard</w:t>
+        <w:t/>
       </w:r>
     </w:p>
     <w:p>
@@ -4725,7 +4725,7 @@
           <w:w w:val="105"/>
           <w:sz w:val="21"/>
         </w:rPr>
-        <w:t>Billy</w:t>
+        <w:t>Peter</w:t>
       </w:r>
       <w:r>
         <w:rPr>
@@ -4743,7 +4743,7 @@
           <w:w w:val="105"/>
           <w:sz w:val="21"/>
         </w:rPr>
-        <w:t>Wilder</w:t>
+        <w:t>Weir</w:t>
       </w:r>
     </w:p>
     <w:p>
@@ -4790,7 +4790,7 @@
           <w:w w:val="105"/>
           <w:sz w:val="21"/>
         </w:rPr>
-        <w:t>Rainbow’s End</w:t>
+        <w:t>The Lottery and Other Stories</w:t>
       </w:r>
       <w:r>
         <w:rPr>
@@ -4844,7 +4844,7 @@
           <w:position w:val="11"/>
           <w:sz w:val="21"/>
         </w:rPr>
-        <w:t>Jane Harrison</w:t>
+        <w:t>Shirley Jackson</w:t>
       </w:r>
       <w:r>
         <w:rPr>
@@ -4889,7 +4889,7 @@
           <w:w w:val="105"/>
           <w:sz w:val="21"/>
         </w:rPr>
-        <w:t>Rainbow’s End</w:t>
+        <w:t>The Lottery and Other Stories</w:t>
       </w:r>
       <w:r>
         <w:rPr>
@@ -4924,7 +4924,7 @@
           <w:w w:val="105"/>
           <w:sz w:val="21"/>
         </w:rPr>
-        <w:t>Jane Harrison</w:t>
+        <w:t>Shirley Jackson</w:t>
       </w:r>
     </w:p>
     <w:p>
@@ -5121,7 +5121,7 @@
           <w:w w:val="105"/>
           <w:sz w:val="21"/>
         </w:rPr>
-        <w:t xml:space="preserve">Sunset Boulevard </w:t>
+        <w:t xml:space="preserve">Picnic at Hanging Rock </w:t>
       </w:r>
       <w:r>
         <w:rPr>
@@ -5130,7 +5130,7 @@
           <w:w w:val="105"/>
           <w:sz w:val="21"/>
         </w:rPr>
-        <w:t>directed by Billy Wilder</w:t>
+        <w:t>directed by Peter Weir</w:t>
       </w:r>
       <w:r>
         <w:rPr>

</xml_diff>